<commit_message>
court(wash): petition for writ, explicit authority ranks and the shared caption indent (fb-595.54.17)
Sort ranks so every engine orders the cases alike; designation at 0.5 in; transcription clean-up.

Co-Authored-By: Claude Opus 5.5 <noreply@anthropic.com>

(fb-595.54.17)
</commit_message>
<xml_diff>
--- a/courts/ninth-circuit/washington/state/supreme-court/petition-for-writ/usage/OUTPUT-petition-for-writ.docx
+++ b/courts/ninth-circuit/washington/state/supreme-court/petition-for-writ/usage/OUTPUT-petition-for-writ.docx
@@ -176,7 +176,7 @@
           <w:p>
             <w:pPr>
               <w:spacing w:before="0" w:after="0" w:line="322" w:lineRule="exact"/>
-              <w:ind w:left="2016" w:firstLine="0"/>
+              <w:ind w:left="720" w:firstLine="0"/>
               <w:jc w:val="left"/>
             </w:pPr>
             <w:r>
@@ -312,7 +312,7 @@
           <w:p>
             <w:pPr>
               <w:spacing w:before="0" w:after="0" w:line="322" w:lineRule="exact"/>
-              <w:ind w:left="2016" w:firstLine="0"/>
+              <w:ind w:left="720" w:firstLine="0"/>
               <w:jc w:val="left"/>
             </w:pPr>
             <w:r>
@@ -6896,10 +6896,10 @@
           <w:i/>
           <w:iCs/>
         </w:rPr>
-        <w:t xml:space="preserve">Servs</w:t>
-      </w:r>
-      <w:r>
-        <w:t xml:space="preserve"> ., 822 F.3d 1037, 1043 (9th Cir. 2016).</w:t>
+        <w:t xml:space="preserve">Servs.</w:t>
+      </w:r>
+      <w:r>
+        <w:t xml:space="preserve">, 822 F.3d 1037, 1043 (9th Cir. 2016).</w:t>
       </w:r>
       <w:r>
         <w:t xml:space="preserve"> </w:t>

</xml_diff>